<commit_message>
Add split submission files (TitlePage + blinded MainText docx); fix clean() to drop duplicate §Authors block; re-zip (18 files).
</commit_message>
<xml_diff>
--- a/submission_package/Manuscript.docx
+++ b/submission_package/Manuscript.docx
@@ -6625,129 +6625,6 @@
         <w:t>. 1972;31(3):259–264.</w:t>
       </w:r>
     </w:p>
-    <w:p>
-      <w:pPr>
-        <w:pStyle w:val="Heading1"/>
-      </w:pPr>
-      <w:r>
-        <w:t>Authors, affiliations, funding and competing interests</w:t>
-      </w:r>
-    </w:p>
-    <w:p>
-      <w:pPr>
-        <w:pStyle w:val="ListBullet"/>
-      </w:pPr>
-      <w:r>
-        <w:rPr>
-          <w:b/>
-        </w:rPr>
-        <w:t>Authors.</w:t>
-      </w:r>
-      <w:r>
-        <w:t xml:space="preserve"> Zhenxin Zheng¹#, Song Chen¹#, Shenbo Huang¹, Chao Qian¹, Hang Yuan¹, Huricha Bao¹</w:t>
-      </w:r>
-      <w:r>
-        <w:rPr>
-          <w:i/>
-        </w:rPr>
-        <w:t>, Qiuyan Jiang²</w:t>
-      </w:r>
-      <w:r>
-        <w:t>.</w:t>
-      </w:r>
-    </w:p>
-    <w:p>
-      <w:pPr>
-        <w:pStyle w:val="ListBullet2"/>
-      </w:pPr>
-      <w:r>
-        <w:t># Zhenxin Zheng and Song Chen contributed equally to this work.</w:t>
-      </w:r>
-    </w:p>
-    <w:p>
-      <w:pPr>
-        <w:pStyle w:val="ListBullet2"/>
-      </w:pPr>
-      <w:r>
-        <w:t>* Corresponding authors: Huricha Bao, MD (baohuricha@126.com) and Qiuyan Jiang, MD (after9951023@gmail.com).</w:t>
-      </w:r>
-    </w:p>
-    <w:p>
-      <w:pPr>
-        <w:pStyle w:val="ListBullet"/>
-      </w:pPr>
-      <w:r>
-        <w:rPr>
-          <w:b/>
-        </w:rPr>
-        <w:t>Affiliations.</w:t>
-      </w:r>
-      <w:r>
-        <w:t xml:space="preserve"> ¹ Department of Orthopedics, The Quzhou Affiliated Hospital of Wenzhou Medical University, Quzhou People's Hospital, Quzhou, Zhejiang Province, 324000, China; ² Department of Surgery, The Quzhou Affiliated Hospital of Wenzhou Medical University, Quzhou People's Hospital, Quzhou, Zhejiang Province, 324000, China.</w:t>
-      </w:r>
-    </w:p>
-    <w:p>
-      <w:pPr>
-        <w:pStyle w:val="ListBullet"/>
-      </w:pPr>
-      <w:r>
-        <w:rPr>
-          <w:b/>
-        </w:rPr>
-        <w:t>Funding.</w:t>
-      </w:r>
-      <w:r>
-        <w:t xml:space="preserve"> None.</w:t>
-      </w:r>
-    </w:p>
-    <w:p>
-      <w:pPr>
-        <w:pStyle w:val="ListBullet"/>
-      </w:pPr>
-      <w:r>
-        <w:rPr>
-          <w:b/>
-        </w:rPr>
-        <w:t>Competing interests.</w:t>
-      </w:r>
-      <w:r>
-        <w:t xml:space="preserve"> The authors declare no competing interests.</w:t>
-      </w:r>
-    </w:p>
-    <w:p>
-      <w:pPr>
-        <w:pStyle w:val="ListBullet"/>
-      </w:pPr>
-      <w:r>
-        <w:rPr>
-          <w:b/>
-        </w:rPr>
-        <w:t>Data availability.</w:t>
-      </w:r>
-      <w:r>
-        <w:t xml:space="preserve"> Summary statistics are from publicly published GWAS (Refs 1–3) and were not redistributed; see </w:t>
-      </w:r>
-      <w:r>
-        <w:rPr>
-          <w:rFonts w:ascii="Consolas" w:hAnsi="Consolas"/>
-          <w:sz w:val="18"/>
-        </w:rPr>
-        <w:t>docs/10_参考文献与原始GWAS来源.md</w:t>
-      </w:r>
-      <w:r>
-        <w:t xml:space="preserve"> for provenance and accessions, and </w:t>
-      </w:r>
-      <w:r>
-        <w:rPr>
-          <w:rFonts w:ascii="Consolas" w:hAnsi="Consolas"/>
-          <w:sz w:val="18"/>
-        </w:rPr>
-        <w:t>code/README.md</w:t>
-      </w:r>
-      <w:r>
-        <w:t xml:space="preserve"> for the analysis repository and reproducibility commands.</w:t>
-      </w:r>
-    </w:p>
     <w:p/>
     <w:p>
       <w:pPr>

</xml_diff>